<commit_message>
docs: update API URLs to 24/7 allocated remote SSH server (http://10.1.75.51:3313/analyzeContour)
</commit_message>
<xml_diff>
--- a/Pond_Catchment_Analysis_Report.docx
+++ b/Pond_Catchment_Analysis_Report.docx
@@ -338,7 +338,7 @@
                 <w:b/>
                 <w:sz w:val="20"/>
               </w:rPr>
-              <w:t>Primary API Endpoint (Network / TA)</w:t>
+              <w:t>Primary API Endpoint (24/7 Remote SSH)</w:t>
             </w:r>
           </w:p>
         </w:tc>
@@ -358,7 +358,7 @@
               <w:rPr>
                 <w:sz w:val="20"/>
               </w:rPr>
-              <w:t>http://10.50.33.238:3313/analyzeContour</w:t>
+              <w:t>http://10.1.75.51:3313/analyzeContour</w:t>
             </w:r>
           </w:p>
         </w:tc>
@@ -368,6 +368,49 @@
           <w:tcPr>
             <w:tcW w:type="dxa" w:w="4032"/>
             <w:shd w:fill="E2E8F0"/>
+            <w:tcMar>
+              <w:top w:w="60" w:type="dxa"/>
+              <w:bottom w:w="60" w:type="dxa"/>
+              <w:left w:w="100" w:type="dxa"/>
+              <w:right w:w="100" w:type="dxa"/>
+            </w:tcMar>
+          </w:tcPr>
+          <w:p>
+            <w:r>
+              <w:rPr>
+                <w:b/>
+                <w:sz w:val="20"/>
+              </w:rPr>
+              <w:t>Remote SSH System</w:t>
+            </w:r>
+          </w:p>
+        </w:tc>
+        <w:tc>
+          <w:tcPr>
+            <w:tcW w:type="dxa" w:w="5328"/>
+            <w:shd w:fill="FFFFFF"/>
+            <w:tcMar>
+              <w:top w:w="60" w:type="dxa"/>
+              <w:bottom w:w="60" w:type="dxa"/>
+              <w:left w:w="100" w:type="dxa"/>
+              <w:right w:w="100" w:type="dxa"/>
+            </w:tcMar>
+          </w:tcPr>
+          <w:p>
+            <w:r>
+              <w:rPr>
+                <w:sz w:val="20"/>
+              </w:rPr>
+              <w:t>student@10.1.75.51 (Port 2313)</w:t>
+            </w:r>
+          </w:p>
+        </w:tc>
+      </w:tr>
+      <w:tr>
+        <w:tc>
+          <w:tcPr>
+            <w:tcW w:type="dxa" w:w="4032"/>
+            <w:shd w:fill="F8FAFC"/>
             <w:tcMar>
               <w:top w:w="60" w:type="dxa"/>
               <w:bottom w:w="60" w:type="dxa"/>
@@ -410,49 +453,6 @@
         <w:tc>
           <w:tcPr>
             <w:tcW w:type="dxa" w:w="4032"/>
-            <w:shd w:fill="F8FAFC"/>
-            <w:tcMar>
-              <w:top w:w="60" w:type="dxa"/>
-              <w:bottom w:w="60" w:type="dxa"/>
-              <w:left w:w="100" w:type="dxa"/>
-              <w:right w:w="100" w:type="dxa"/>
-            </w:tcMar>
-          </w:tcPr>
-          <w:p>
-            <w:r>
-              <w:rPr>
-                <w:b/>
-                <w:sz w:val="20"/>
-              </w:rPr>
-              <w:t>Public WAN Endpoint</w:t>
-            </w:r>
-          </w:p>
-        </w:tc>
-        <w:tc>
-          <w:tcPr>
-            <w:tcW w:type="dxa" w:w="5328"/>
-            <w:shd w:fill="FFFFFF"/>
-            <w:tcMar>
-              <w:top w:w="60" w:type="dxa"/>
-              <w:bottom w:w="60" w:type="dxa"/>
-              <w:left w:w="100" w:type="dxa"/>
-              <w:right w:w="100" w:type="dxa"/>
-            </w:tcMar>
-          </w:tcPr>
-          <w:p>
-            <w:r>
-              <w:rPr>
-                <w:sz w:val="20"/>
-              </w:rPr>
-              <w:t>http://103.147.138.252:3313/analyzeContour</w:t>
-            </w:r>
-          </w:p>
-        </w:tc>
-      </w:tr>
-      <w:tr>
-        <w:tc>
-          <w:tcPr>
-            <w:tcW w:type="dxa" w:w="4032"/>
             <w:shd w:fill="E2E8F0"/>
             <w:tcMar>
               <w:top w:w="60" w:type="dxa"/>
@@ -487,7 +487,7 @@
               <w:rPr>
                 <w:sz w:val="20"/>
               </w:rPr>
-              <w:t>http://10.50.33.238:3313/findCatchment</w:t>
+              <w:t>http://10.1.75.51:3313/findCatchment</w:t>
             </w:r>
           </w:p>
         </w:tc>
@@ -616,7 +616,7 @@
               <w:rPr>
                 <w:sz w:val="20"/>
               </w:rPr>
-              <w:t>http://10.50.33.238:3313/docs (or http://localhost:3313/docs)</w:t>
+              <w:t>http://10.1.75.51:3313/docs</w:t>
             </w:r>
           </w:p>
         </w:tc>
@@ -659,7 +659,7 @@
               <w:rPr>
                 <w:sz w:val="20"/>
               </w:rPr>
-              <w:t>http://10.50.33.238:3313/ (or http://localhost:3313/)</w:t>
+              <w:t>http://10.1.75.51:3313/</w:t>
             </w:r>
           </w:p>
         </w:tc>
@@ -1066,7 +1066,7 @@
                 <w:color w:val="4ADE80"/>
                 <w:sz w:val="19"/>
               </w:rPr>
-              <w:t>curl -X POST "http://10.50.33.238:3313/analyzeContour" \</w:t>
+              <w:t>curl -X POST "http://10.1.75.51:3313/analyzeContour" \</w:t>
               <w:br/>
               <w:t xml:space="preserve">  -F "contour_map=@contours_1m.kml"</w:t>
             </w:r>
@@ -1118,7 +1118,7 @@
         <w:rPr>
           <w:b/>
         </w:rPr>
-        <w:t>http://10.50.33.238:3313/analyzeContour</w:t>
+        <w:t>http://10.1.75.51:3313/analyzeContour</w:t>
       </w:r>
       <w:r>
         <w:t>.</w:t>

</xml_diff>